<commit_message>
docs(req): revision de coherencia de la documentacion (CU-01 a CU-08, HU-11 a HU-13)
Closes #32
</commit_message>
<xml_diff>
--- a/02_req/editablesWORD/ChuroViaje_Documento_de_Vision.docx
+++ b/02_req/editablesWORD/ChuroViaje_Documento_de_Vision.docx
@@ -131,7 +131,7 @@
               <w:rPr>
                 <w:color w:val="646464"/>
               </w:rPr>
-              <w:t>0.3 - Monitoreo de WhatsApp con LLM</w:t>
+              <w:t xml:space="preserve">0.4 - Revisión de coherencia de la documentación</w:t>
             </w:r>
           </w:p>
         </w:tc>
@@ -166,7 +166,7 @@
               <w:rPr>
                 <w:color w:val="646464"/>
               </w:rPr>
-              <w:t>25/09/2026</w:t>
+              <w:t xml:space="preserve">02/09/2026</w:t>
             </w:r>
           </w:p>
         </w:tc>
@@ -207,7 +207,7 @@
                 <w:color w:val="646464"/>
                 <w:lang w:val="es-US"/>
               </w:rPr>
-              <w:t xml:space="preserve">Antonio Cuellar, Jorge Cabrera, Benjamin Sirpa, Franz Caceres, Marcelo Quiroga y Alex Quispe</w:t>
+              <w:t xml:space="preserve">Antonio Cuellar, Jorge Cabrera, Franz Caceres, Marcelo Quiroga y Alex Quispe</w:t>
             </w:r>
           </w:p>
         </w:tc>
@@ -587,6 +587,78 @@
           </w:p>
         </w:tc>
       </w:tr>
+      <w:tr>
+        <w:trPr>
+          <w:jc w:val="center"/>
+        </w:trPr>
+        <w:tc>
+          <w:tcPr>
+            <w:tcW w:w="1728" w:type="dxa"/>
+          </w:tcPr>
+          <w:p>
+            <w:pPr>
+              <w:jc w:val="center"/>
+            </w:pPr>
+            <w:r>
+              <w:rPr>
+                <w:sz w:val="18"/>
+              </w:rPr>
+              <w:t xml:space="preserve">06/10/2026</w:t>
+            </w:r>
+          </w:p>
+        </w:tc>
+        <w:tc>
+          <w:tcPr>
+            <w:tcW w:w="1152" w:type="dxa"/>
+          </w:tcPr>
+          <w:p>
+            <w:pPr>
+              <w:jc w:val="center"/>
+            </w:pPr>
+            <w:r>
+              <w:rPr>
+                <w:sz w:val="18"/>
+              </w:rPr>
+              <w:t xml:space="preserve">0.4</w:t>
+            </w:r>
+          </w:p>
+        </w:tc>
+        <w:tc>
+          <w:tcPr>
+            <w:tcW w:w="4752" w:type="dxa"/>
+          </w:tcPr>
+          <w:p>
+            <w:pPr>
+              <w:rPr>
+                <w:lang w:val="es-US"/>
+              </w:rPr>
+            </w:pPr>
+            <w:r>
+              <w:rPr>
+                <w:sz w:val="18"/>
+                <w:lang w:val="es-US"/>
+              </w:rPr>
+              <w:t xml:space="preserve">Revisión de coherencia con los casos de uso, las historias de usuario y las decisiones tomadas para la Construcción: acceso solo con cuenta de Google, Mapbox como proveedor de mapas, WhatsApp como fuente principal de combustible con confirmación opcional de los conductores, telemetría solo con la app abierta, simulador que envía los datos al backend, estado de los surtidores por tipo de combustible y privacidad frente al proveedor del LLM. Se completan stakeholders, referencias y requisitos de documentación, y se actualiza la lista de autores.</w:t>
+            </w:r>
+          </w:p>
+        </w:tc>
+        <w:tc>
+          <w:tcPr>
+            <w:tcW w:w="1728" w:type="dxa"/>
+          </w:tcPr>
+          <w:p>
+            <w:pPr>
+              <w:jc w:val="center"/>
+            </w:pPr>
+            <w:r>
+              <w:rPr>
+                <w:sz w:val="18"/>
+              </w:rPr>
+              <w:t xml:space="preserve">Equipo ChuroViaje</w:t>
+            </w:r>
+          </w:p>
+        </w:tc>
+      </w:tr>
     </w:tbl>
     <w:p>
       <w:pPr>
@@ -813,7 +885,7 @@
         <w:rPr>
           <w:lang w:val="es-US"/>
         </w:rPr>
-        <w:t>el sistema debe permitir a los usuarios marcar incidentes en el mapa. Una característica clave es la categorización por color (por ejemplo, rojo para choques, azul para controles).</w:t>
+        <w:t xml:space="preserve">el sistema debe permitir a los usuarios marcar incidentes en el mapa e indicar hace cuánto ocurrieron. Una característica clave es la categorización por color (por ejemplo, rojo para choques, azul para controles). Además, los conductores pueden votar si un evento reportado es real o falso.</w:t>
       </w:r>
     </w:p>
     <w:p>
@@ -863,7 +935,7 @@
         <w:rPr>
           <w:lang w:val="es-US"/>
         </w:rPr>
-        <w:t>ChuroViaje debe consolidar y mostrar el estado de los surtidores.</w:t>
+        <w:t xml:space="preserve">ChuroViaje debe consolidar y mostrar el estado de los surtidores por tipo de combustible.</w:t>
       </w:r>
     </w:p>
     <w:p>
@@ -888,7 +960,7 @@
         <w:rPr>
           <w:lang w:val="es-US"/>
         </w:rPr>
-        <w:t>dado que es difícil tener miles de usuarios reales el día de la defensa del proyecto, es obligatorio desarrollar un script (por ejemplo, en Python) para inyectar “usuarios fantasma” y demostrar que el sistema funciona bajo carga.</w:t>
+        <w:t xml:space="preserve">dado que es difícil tener miles de usuarios reales el día de la defensa del proyecto, es obligatorio desarrollar un script en Python que simule “usuarios fantasma” enviando sus datos al backend, para demostrar que el sistema funciona bajo carga.</w:t>
       </w:r>
     </w:p>
     <w:p>
@@ -985,13 +1057,13 @@
           <w:b/>
           <w:lang w:val="es-US"/>
         </w:rPr>
-        <w:t xml:space="preserve">Captura pasiva de datos: </w:t>
+        <w:t xml:space="preserve">Telemetría solo con la app abierta: </w:t>
       </w:r>
       <w:r>
         <w:rPr>
           <w:lang w:val="es-US"/>
         </w:rPr>
-        <w:t>la aplicación obtendrá la velocidad y posición en segundo plano, solo si detecta actividad de conducción. Si un usuario está detenido en una vía vehicular por más tiempo del umbral definido, el sistema debe interpretar automáticamente que hay tráfico pesado.</w:t>
+        <w:t xml:space="preserve">la aplicación obtendrá la velocidad y posición únicamente mientras está abierta en pantalla, con o sin una ruta activa, y nunca en segundo plano. Si un usuario está detenido en una vía vehicular por más tiempo del umbral definido, el sistema debe interpretar automáticamente que hay tráfico pesado.</w:t>
       </w:r>
     </w:p>
     <w:p>
@@ -1010,13 +1082,38 @@
           <w:b/>
           <w:lang w:val="es-US"/>
         </w:rPr>
-        <w:t xml:space="preserve">Flexibilidad en la fuente de datos de surtidores: </w:t>
+        <w:t xml:space="preserve">Fuente de datos de surtidores: </w:t>
       </w:r>
       <w:r>
         <w:rPr>
           <w:lang w:val="es-US"/>
         </w:rPr>
-        <w:t>el alcance contempla que el estado de los surtidores se obtenga ya sea por una API externa (si los surtidores dan acceso) o, en su defecto, mediante el monitoreo de grupos de WhatsApp donde se comparte la disponibilidad de combustible, sin necesidad de solicitar reportes directos a los usuarios.</w:t>
+        <w:t xml:space="preserve">el estado de los surtidores se obtiene del monitoreo de grupos de WhatsApp donde se comparte la disponibilidad de combustible, sin depender de reportes de los usuarios. Como complemento opcional, el conductor puede confirmar que acaba de recargar e indicar el tipo de combustible. Si en el futuro los surtidores dan acceso a una API externa, esta pasaría a ser la fuente primaria.</w:t>
+      </w:r>
+    </w:p>
+    <w:p>
+      <w:pPr>
+        <w:pStyle w:val="Prrafodelista"/>
+        <w:numPr>
+          <w:ilvl w:val="0"/>
+          <w:numId w:val="18"/>
+        </w:numPr>
+        <w:rPr>
+          <w:lang w:val="es-US"/>
+        </w:rPr>
+      </w:pPr>
+      <w:r>
+        <w:rPr>
+          <w:b/>
+          <w:lang w:val="es-US"/>
+        </w:rPr>
+        <w:t xml:space="preserve">Sesión obligatoria: </w:t>
+      </w:r>
+      <w:r>
+        <w:rPr>
+          <w:lang w:val="es-US"/>
+        </w:rPr>
+        <w:t xml:space="preserve">todas las funciones de la app requieren haber iniciado sesión con una cuenta de Google; el sistema no maneja contraseñas propias.</w:t>
       </w:r>
     </w:p>
     <w:p>
@@ -1093,7 +1190,32 @@
         <w:rPr>
           <w:lang w:val="es-US"/>
         </w:rPr>
-        <w:t>si los surtidores no otorgan acceso a sus sistemas o API, no es responsabilidad del equipo lograr esa integración automatizada. El sistema dependerá del monitoreo de grupos de WhatsApp en ese caso.</w:t>
+        <w:t xml:space="preserve">no es responsabilidad del equipo lograr una integración automatizada con los sistemas o la API de los surtidores. El sistema se apoya en el monitoreo de grupos de WhatsApp.</w:t>
+      </w:r>
+    </w:p>
+    <w:p>
+      <w:pPr>
+        <w:pStyle w:val="Prrafodelista"/>
+        <w:numPr>
+          <w:ilvl w:val="0"/>
+          <w:numId w:val="20"/>
+        </w:numPr>
+        <w:rPr>
+          <w:lang w:val="es-US"/>
+        </w:rPr>
+      </w:pPr>
+      <w:r>
+        <w:rPr>
+          <w:b/>
+          <w:lang w:val="es-US"/>
+        </w:rPr>
+        <w:t xml:space="preserve">Rastreo en segundo plano: </w:t>
+      </w:r>
+      <w:r>
+        <w:rPr>
+          <w:lang w:val="es-US"/>
+        </w:rPr>
+        <w:t xml:space="preserve">la app no obtiene la ubicación del usuario cuando está minimizada o cerrada.</w:t>
       </w:r>
     </w:p>
     <w:p>
@@ -1376,7 +1498,7 @@
               <w:rPr>
                 <w:lang w:val="es-US"/>
               </w:rPr>
-              <w:t>Application Programming Interface. Interfaz que permite la comunicación entre el backend, el motor de enrutamiento y servicios externos (mapas, surtidores).</w:t>
+              <w:t xml:space="preserve">Application Programming Interface. Interfaz que permite la comunicación entre el backend, el motor de enrutamiento y servicios externos (mapas, Google Sign-In, proveedor del LLM).</w:t>
             </w:r>
           </w:p>
         </w:tc>
@@ -1485,43 +1607,7 @@
               <w:rPr>
                 <w:lang w:val="es-US"/>
               </w:rPr>
-              <w:t>OpenStreetMap. Proyecto colaborativo de mapeo libre utilizado como fuente de datos cartográficos del sistema.</w:t>
-            </w:r>
-          </w:p>
-        </w:tc>
-      </w:tr>
-      <w:tr>
-        <w:trPr>
-          <w:jc w:val="center"/>
-        </w:trPr>
-        <w:tc>
-          <w:tcPr>
-            <w:tcW w:w="2880" w:type="dxa"/>
-          </w:tcPr>
-          <w:p>
-            <w:r>
-              <w:rPr>
-                <w:b/>
-              </w:rPr>
-              <w:t>OSRM</w:t>
-            </w:r>
-          </w:p>
-        </w:tc>
-        <w:tc>
-          <w:tcPr>
-            <w:tcW w:w="6480" w:type="dxa"/>
-          </w:tcPr>
-          <w:p>
-            <w:pPr>
-              <w:rPr>
-                <w:lang w:val="es-US"/>
-              </w:rPr>
-            </w:pPr>
-            <w:r>
-              <w:rPr>
-                <w:lang w:val="es-US"/>
-              </w:rPr>
-              <w:t>Open Source Routing Machine. Motor de enrutamiento de código abierto autoalojado, evaluado como alternativa a Mapbox.</w:t>
+              <w:t xml:space="preserve">OpenStreetMap. Proyecto colaborativo de mapeo libre; es la base de datos cartográficos sobre la que trabaja Mapbox.</w:t>
             </w:r>
           </w:p>
         </w:tc>
@@ -1634,6 +1720,42 @@
           </w:p>
         </w:tc>
       </w:tr>
+      <w:tr>
+        <w:trPr>
+          <w:jc w:val="center"/>
+        </w:trPr>
+        <w:tc>
+          <w:tcPr>
+            <w:tcW w:w="2880" w:type="dxa"/>
+          </w:tcPr>
+          <w:p>
+            <w:r>
+              <w:rPr>
+                <w:b/>
+              </w:rPr>
+              <w:t xml:space="preserve">Telemetría</w:t>
+            </w:r>
+          </w:p>
+        </w:tc>
+        <w:tc>
+          <w:tcPr>
+            <w:tcW w:w="6480" w:type="dxa"/>
+          </w:tcPr>
+          <w:p>
+            <w:pPr>
+              <w:rPr>
+                <w:lang w:val="es-US"/>
+              </w:rPr>
+            </w:pPr>
+            <w:r>
+              <w:rPr>
+                <w:lang w:val="es-US"/>
+              </w:rPr>
+              <w:t xml:space="preserve">Velocidad y posición del dispositivo que la app envía al backend mientras está abierta en pantalla, usadas para detectar congestión.</w:t>
+            </w:r>
+          </w:p>
+        </w:tc>
+      </w:tr>
     </w:tbl>
     <w:p>
       <w:pPr>
@@ -1662,10 +1784,7 @@
         <w:rPr>
           <w:lang w:val="es-US"/>
         </w:rPr>
-        <w:t xml:space="preserve">Proporcione una lista completa de todos los documentos, normativas, entrevistas o bibliografía técnica referenciada en este documento. </w:t>
-      </w:r>
-      <w:r>
-        <w:t>Identifíquelos por título, fecha y organización emisora.</w:t>
+        <w:t xml:space="preserve">Documentos del proyecto a los que hace referencia este Documento de Visión:</w:t>
       </w:r>
     </w:p>
     <w:tbl>
@@ -1758,7 +1877,7 @@
               <w:rPr>
                 <w:lang w:val="es-US"/>
               </w:rPr>
-              <w:t>[Ej. Guía de Especificación de Casos de Uso RUP]</w:t>
+              <w:t xml:space="preserve">Especificación de Casos de Uso de ChuroViaje (CU-01 a CU-08)</w:t>
             </w:r>
           </w:p>
         </w:tc>
@@ -1768,7 +1887,7 @@
           </w:tcPr>
           <w:p>
             <w:r>
-              <w:t>[DD/MM/AAAA]</w:t>
+              <w:t xml:space="preserve">06/10/2026</w:t>
             </w:r>
           </w:p>
         </w:tc>
@@ -1778,7 +1897,136 @@
           </w:tcPr>
           <w:p>
             <w:r>
-              <w:t>[FTE / Repositorio]</w:t>
+              <w:t xml:space="preserve">Equipo ChuroViaje / Repositorio del proyecto</w:t>
+            </w:r>
+          </w:p>
+        </w:tc>
+      </w:tr>
+      <w:tr>
+        <w:trPr>
+          <w:jc w:val="center"/>
+        </w:trPr>
+        <w:tc>
+          <w:tcPr>
+            <w:tcW w:w="4320" w:type="dxa"/>
+          </w:tcPr>
+          <w:p>
+            <w:pPr>
+              <w:rPr>
+                <w:lang w:val="es-US"/>
+              </w:rPr>
+            </w:pPr>
+            <w:r>
+              <w:rPr>
+                <w:lang w:val="es-US"/>
+              </w:rPr>
+              <w:t xml:space="preserve">Historias de Usuario de ChuroViaje (HU-01 a HU-13)</w:t>
+            </w:r>
+          </w:p>
+        </w:tc>
+        <w:tc>
+          <w:tcPr>
+            <w:tcW w:w="2160" w:type="dxa"/>
+          </w:tcPr>
+          <w:p>
+            <w:r>
+              <w:t xml:space="preserve">06/10/2026</w:t>
+            </w:r>
+          </w:p>
+        </w:tc>
+        <w:tc>
+          <w:tcPr>
+            <w:tcW w:w="2880" w:type="dxa"/>
+          </w:tcPr>
+          <w:p>
+            <w:r>
+              <w:t xml:space="preserve">Equipo ChuroViaje / Repositorio del proyecto</w:t>
+            </w:r>
+          </w:p>
+        </w:tc>
+      </w:tr>
+      <w:tr>
+        <w:trPr>
+          <w:jc w:val="center"/>
+        </w:trPr>
+        <w:tc>
+          <w:tcPr>
+            <w:tcW w:w="4320" w:type="dxa"/>
+          </w:tcPr>
+          <w:p>
+            <w:pPr>
+              <w:rPr>
+                <w:lang w:val="es-US"/>
+              </w:rPr>
+            </w:pPr>
+            <w:r>
+              <w:rPr>
+                <w:lang w:val="es-US"/>
+              </w:rPr>
+              <w:t xml:space="preserve">Decisión de arquitectura: Conexión a WhatsApp para el monitoreo de surtidores (decision_conexion_whatsapp.md, v1.3)</w:t>
+            </w:r>
+          </w:p>
+        </w:tc>
+        <w:tc>
+          <w:tcPr>
+            <w:tcW w:w="2160" w:type="dxa"/>
+          </w:tcPr>
+          <w:p>
+            <w:r>
+              <w:t xml:space="preserve">06/10/2026</w:t>
+            </w:r>
+          </w:p>
+        </w:tc>
+        <w:tc>
+          <w:tcPr>
+            <w:tcW w:w="2880" w:type="dxa"/>
+          </w:tcPr>
+          <w:p>
+            <w:r>
+              <w:t xml:space="preserve">Equipo ChuroViaje / Repositorio del proyecto</w:t>
+            </w:r>
+          </w:p>
+        </w:tc>
+      </w:tr>
+      <w:tr>
+        <w:trPr>
+          <w:jc w:val="center"/>
+        </w:trPr>
+        <w:tc>
+          <w:tcPr>
+            <w:tcW w:w="4320" w:type="dxa"/>
+          </w:tcPr>
+          <w:p>
+            <w:pPr>
+              <w:rPr>
+                <w:lang w:val="es-US"/>
+              </w:rPr>
+            </w:pPr>
+            <w:r>
+              <w:rPr>
+                <w:lang w:val="es-US"/>
+              </w:rPr>
+              <w:t xml:space="preserve">Matriz de Requisitos y Trazabilidad de ChuroViaje</w:t>
+            </w:r>
+          </w:p>
+        </w:tc>
+        <w:tc>
+          <w:tcPr>
+            <w:tcW w:w="2160" w:type="dxa"/>
+          </w:tcPr>
+          <w:p>
+            <w:r>
+              <w:t xml:space="preserve">06/10/2026</w:t>
+            </w:r>
+          </w:p>
+        </w:tc>
+        <w:tc>
+          <w:tcPr>
+            <w:tcW w:w="2880" w:type="dxa"/>
+          </w:tcPr>
+          <w:p>
+            <w:r>
+              <w:t xml:space="preserve">Equipo ChuroViaje / SIS-213 Ingeniería de Software</w:t>
             </w:r>
           </w:p>
         </w:tc>
@@ -2542,6 +2790,159 @@
           </w:p>
         </w:tc>
       </w:tr>
+      <w:tr>
+        <w:trPr>
+          <w:jc w:val="center"/>
+        </w:trPr>
+        <w:tc>
+          <w:tcPr>
+            <w:tcW w:w="2592" w:type="dxa"/>
+          </w:tcPr>
+          <w:p>
+            <w:r>
+              <w:t xml:space="preserve">Conductores de la ciudad de Tarija</w:t>
+            </w:r>
+          </w:p>
+        </w:tc>
+        <w:tc>
+          <w:tcPr>
+            <w:tcW w:w="4608" w:type="dxa"/>
+          </w:tcPr>
+          <w:p>
+            <w:pPr>
+              <w:rPr>
+                <w:lang w:val="es-US"/>
+              </w:rPr>
+            </w:pPr>
+            <w:r>
+              <w:rPr>
+                <w:lang w:val="es-US"/>
+              </w:rPr>
+              <w:t xml:space="preserve">Usuarios finales de la aplicación. Aportan los reportes viales, los votos sobre los eventos y la confirmación de combustible.</w:t>
+            </w:r>
+          </w:p>
+        </w:tc>
+        <w:tc>
+          <w:tcPr>
+            <w:tcW w:w="2160" w:type="dxa"/>
+          </w:tcPr>
+          <w:p>
+            <w:pPr>
+              <w:rPr>
+                <w:lang w:val="es-US"/>
+              </w:rPr>
+            </w:pPr>
+            <w:r>
+              <w:rPr>
+                <w:lang w:val="es-US"/>
+              </w:rPr>
+              <w:t xml:space="preserve">Llegar más rápido a su destino y saber dónde hay combustible, con información confiable y sin que la app los rastree en segundo plano.</w:t>
+            </w:r>
+          </w:p>
+        </w:tc>
+      </w:tr>
+      <w:tr>
+        <w:trPr>
+          <w:jc w:val="center"/>
+        </w:trPr>
+        <w:tc>
+          <w:tcPr>
+            <w:tcW w:w="2592" w:type="dxa"/>
+          </w:tcPr>
+          <w:p>
+            <w:r>
+              <w:t xml:space="preserve">Equipo de desarrollo</w:t>
+            </w:r>
+          </w:p>
+        </w:tc>
+        <w:tc>
+          <w:tcPr>
+            <w:tcW w:w="4608" w:type="dxa"/>
+          </w:tcPr>
+          <w:p>
+            <w:pPr>
+              <w:rPr>
+                <w:lang w:val="es-US"/>
+              </w:rPr>
+            </w:pPr>
+            <w:r>
+              <w:rPr>
+                <w:lang w:val="es-US"/>
+              </w:rPr>
+              <w:t xml:space="preserve">Diseña, construye, despliega y mantiene el sistema. Cubre los roles de administrador del sistema, de infraestructura y de seguridad, y de equipo técnico que aparecen en los casos de uso.</w:t>
+            </w:r>
+          </w:p>
+        </w:tc>
+        <w:tc>
+          <w:tcPr>
+            <w:tcW w:w="2160" w:type="dxa"/>
+          </w:tcPr>
+          <w:p>
+            <w:pPr>
+              <w:rPr>
+                <w:lang w:val="es-US"/>
+              </w:rPr>
+            </w:pPr>
+            <w:r>
+              <w:rPr>
+                <w:lang w:val="es-US"/>
+              </w:rPr>
+              <w:t xml:space="preserve">Entregar las funcionalidades comprometidas dentro del semestre, con un sistema estable y demostrable bajo carga.</w:t>
+            </w:r>
+          </w:p>
+        </w:tc>
+      </w:tr>
+      <w:tr>
+        <w:trPr>
+          <w:jc w:val="center"/>
+        </w:trPr>
+        <w:tc>
+          <w:tcPr>
+            <w:tcW w:w="2592" w:type="dxa"/>
+          </w:tcPr>
+          <w:p>
+            <w:r>
+              <w:t xml:space="preserve">Administradores y miembros de los grupos de WhatsApp</w:t>
+            </w:r>
+          </w:p>
+        </w:tc>
+        <w:tc>
+          <w:tcPr>
+            <w:tcW w:w="4608" w:type="dxa"/>
+          </w:tcPr>
+          <w:p>
+            <w:pPr>
+              <w:rPr>
+                <w:lang w:val="es-US"/>
+              </w:rPr>
+            </w:pPr>
+            <w:r>
+              <w:rPr>
+                <w:lang w:val="es-US"/>
+              </w:rPr>
+              <w:t xml:space="preserve">Los administradores autorizan la presencia de la cuenta del proyecto en sus grupos; los miembros escriben los mensajes que el sistema interpreta.</w:t>
+            </w:r>
+          </w:p>
+        </w:tc>
+        <w:tc>
+          <w:tcPr>
+            <w:tcW w:w="2160" w:type="dxa"/>
+          </w:tcPr>
+          <w:p>
+            <w:pPr>
+              <w:rPr>
+                <w:lang w:val="es-US"/>
+              </w:rPr>
+            </w:pPr>
+            <w:r>
+              <w:rPr>
+                <w:lang w:val="es-US"/>
+              </w:rPr>
+              <w:t xml:space="preserve">Que no se almacenen sus datos personales y que el texto de sus mensajes no se conserve después del análisis.</w:t>
+            </w:r>
+          </w:p>
+        </w:tc>
+      </w:tr>
     </w:tbl>
     <w:p>
       <w:pPr>
@@ -2670,7 +3071,7 @@
               <w:rPr>
                 <w:lang w:val="es-US"/>
               </w:rPr>
-              <w:t>Reporta y visualiza eventos viales categorizados por color, consulta y sigue rutas optimizadas hacia su destino, y consulta la disponibilidad de combustible en los surtidores de la ciudad.</w:t>
+              <w:t xml:space="preserve">Reporta y visualiza eventos viales categorizados por color, vota si son reales o falsos, consulta y sigue rutas optimizadas hacia su destino, consulta la disponibilidad de combustible en los surtidores de la ciudad y puede confirmar que acaba de recargar.</w:t>
             </w:r>
           </w:p>
         </w:tc>
@@ -2680,7 +3081,50 @@
           </w:tcPr>
           <w:p>
             <w:r>
-              <w:t>Docentes Evaluadores (SIS-227 y SIS-213)</w:t>
+              <w:t xml:space="preserve">Conductores de la ciudad de Tarija</w:t>
+            </w:r>
+          </w:p>
+        </w:tc>
+      </w:tr>
+      <w:tr>
+        <w:trPr>
+          <w:jc w:val="center"/>
+        </w:trPr>
+        <w:tc>
+          <w:tcPr>
+            <w:tcW w:w="2592" w:type="dxa"/>
+          </w:tcPr>
+          <w:p>
+            <w:r>
+              <w:t xml:space="preserve">Desarrollador</w:t>
+            </w:r>
+          </w:p>
+        </w:tc>
+        <w:tc>
+          <w:tcPr>
+            <w:tcW w:w="4608" w:type="dxa"/>
+          </w:tcPr>
+          <w:p>
+            <w:pPr>
+              <w:rPr>
+                <w:lang w:val="es-US"/>
+              </w:rPr>
+            </w:pPr>
+            <w:r>
+              <w:rPr>
+                <w:lang w:val="es-US"/>
+              </w:rPr>
+              <w:t xml:space="preserve">Ejecuta el simulador de tráfico para probar el sistema bajo carga y revisa sus resultados.</w:t>
+            </w:r>
+          </w:p>
+        </w:tc>
+        <w:tc>
+          <w:tcPr>
+            <w:tcW w:w="2160" w:type="dxa"/>
+          </w:tcPr>
+          <w:p>
+            <w:r>
+              <w:t xml:space="preserve">Equipo de desarrollo</w:t>
             </w:r>
           </w:p>
         </w:tc>
@@ -2790,7 +3234,7 @@
         <w:rPr>
           <w:lang w:val="es-US"/>
         </w:rPr>
-        <w:t>Un servicio de extracción desarrollado en Node.js, que lee los mensajes de los grupos de WhatsApp monitoreados mediante la librería Baileys; los mensajes se interpretan por lotes con un LLM de un proveedor externo y el resultado se envía al backend Java.</w:t>
+        <w:t xml:space="preserve">Un servicio de WhatsApp/LLM desarrollado en Node.js, que lee los mensajes de los grupos de WhatsApp monitoreados mediante la librería Baileys, los interpreta por lotes con un LLM de un proveedor externo y envía el resultado al backend Java.</w:t>
       </w:r>
     </w:p>
     <w:p>
@@ -2808,7 +3252,7 @@
         <w:rPr>
           <w:lang w:val="es-US"/>
         </w:rPr>
-        <w:t>Como proveedor de mapas se evalúan dos opciones basadas en datos de OpenStreetMap: Mapbox (servicio externo con SDK maduro para Flutter).</w:t>
+        <w:t xml:space="preserve">Como proveedor de mapas se utiliza Mapbox (servicio externo con SDK maduro para Flutter), cuyos datos se basan en OpenStreetMap.</w:t>
       </w:r>
     </w:p>
     <w:p>
@@ -2947,7 +3391,7 @@
               <w:rPr>
                 <w:lang w:val="es-US"/>
               </w:rPr>
-              <w:t>Los usuarios reportan y visualizan en el mapa eventos categorizados por colores (ej. choques en rojo, controles en azul).</w:t>
+              <w:t xml:space="preserve">Los usuarios reportan y visualizan en el mapa eventos categorizados por colores (ej. choques en rojo, controles en azul), indican hace cuánto ocurrieron y votan si los eventos de otros conductores son reales o falsos.</w:t>
             </w:r>
           </w:p>
         </w:tc>
@@ -3055,7 +3499,7 @@
               <w:rPr>
                 <w:lang w:val="es-US"/>
               </w:rPr>
-              <w:t>El rastreo de ubicación se delega a las APIs nativas del sistema operativo, activando el GPS solo cuando se detecta desplazamiento vehicular.</w:t>
+              <w:t xml:space="preserve">La app obtiene la velocidad y posición mediante las APIs nativas del sistema operativo y solo mientras está abierta en pantalla; no usa el GPS en segundo plano.</w:t>
             </w:r>
           </w:p>
         </w:tc>
@@ -3109,7 +3553,7 @@
               <w:rPr>
                 <w:lang w:val="es-US"/>
               </w:rPr>
-              <w:t>Consolida el estado de los surtidores (disponibilidad, tipo de combustible, tamaño de fila) mediante integración de API externa o, en su defecto, mediante el monitoreo de grupos de WhatsApp.</w:t>
+              <w:t xml:space="preserve">Consolida el estado de los surtidores por tipo de combustible (Gasolina, Diesel, Gasolina Premium o Diesel ULS; “Desconocido” cuando un mensaje no lo indica) y, cuando se conoce, el tamaño de fila, mediante el monitoreo de grupos de WhatsApp, complementado con la confirmación opcional de los conductores que acaban de recargar, quienes indican el tipo.</w:t>
             </w:r>
           </w:p>
         </w:tc>
@@ -3163,7 +3607,7 @@
               <w:rPr>
                 <w:lang w:val="es-US"/>
               </w:rPr>
-              <w:t>Script (ej. Python) que inyecta datos de ubicación de “usuarios fantasma” a la base de datos.</w:t>
+              <w:t xml:space="preserve">Script en Python que simula “usuarios fantasma” y envía al backend sus datos de ubicación y sus eventos.</w:t>
             </w:r>
           </w:p>
         </w:tc>
@@ -3220,7 +3664,7 @@
         <w:rPr>
           <w:lang w:val="es-US"/>
         </w:rPr>
-        <w:t>La disponibilidad continua del servidor VPS que aloja el backend y la base de datos, la estabilidad del proveedor de mapas elegido (Mapbox), que los usuarios otorguen los permisos de ubicación necesarios para el funcionamiento en segundo plano, y que, de no lograrse acceso oficial a los sistemas de las gasolineras, los grupos de WhatsApp monitoreados aporten información suficiente y confiable sobre el estado de los surtidores para sostener el módulo de disponibilidad de combustible, que el número dedicado del proyecto no sea bloqueado por usar un cliente no oficial de WhatsApp, y la disponibilidad del proveedor del LLM utilizado para interpretar los mensajes.</w:t>
+        <w:t xml:space="preserve">La disponibilidad continua del servidor VPS que aloja el backend y la base de datos, la estabilidad del proveedor de mapas elegido (Mapbox), que los usuarios otorguen los permisos de ubicación necesarios mientras usan la app, que los grupos de WhatsApp monitoreados aporten información suficiente y confiable sobre el estado de los surtidores para sostener el módulo de disponibilidad de combustible, que el número dedicado del proyecto no sea bloqueado por usar un cliente no oficial de WhatsApp, la disponibilidad del proveedor del LLM utilizado para interpretar los mensajes y la disponibilidad de Google Sign-In para el inicio de sesión.</w:t>
       </w:r>
     </w:p>
     <w:p>
@@ -3247,7 +3691,7 @@
         <w:rPr>
           <w:lang w:val="es-US"/>
         </w:rPr>
-        <w:t xml:space="preserve">La infraestructura estimada del proyecto consiste en un servidor VPS básico (aprox. $5/mes) para alojar el backend y la base de datos, y un dominio web (aprox. $15/año) con configuración DNS para exponer las APIs y los correos transaccionales. A esto se suma el consumo del proveedor del LLM para el análisis de los mensajes de WhatsApp, cuyo costo depende del proveedor elegido y se reduce al analizar por lotes y solo cuando hay mensajes nuevos. </w:t>
+        <w:t xml:space="preserve">La infraestructura estimada del proyecto consiste en un servidor VPS básico (aprox. $5/mes) para alojar el backend y la base de datos, y un dominio web (aprox. $15/año) con configuración DNS para exponer las APIs. A esto se suma el consumo del proveedor del LLM para el análisis de los mensajes de WhatsApp, cuyo costo depende del proveedor elegido y se reduce al analizar por lotes y solo cuando hay mensajes nuevos. </w:t>
       </w:r>
     </w:p>
     <w:p>
@@ -3301,7 +3745,7 @@
         <w:rPr>
           <w:lang w:val="es-US"/>
         </w:rPr>
-        <w:t>Enumere las restricciones operativas, tecnológicas, presupuestarias o regulatorias que limitan el diseño del sistema de información:</w:t>
+        <w:t xml:space="preserve">Restricciones operativas, tecnológicas y legales que limitan el diseño del sistema de información:</w:t>
       </w:r>
     </w:p>
     <w:p>
@@ -3319,7 +3763,7 @@
         <w:rPr>
           <w:lang w:val="es-US"/>
         </w:rPr>
-        <w:t>Restricción de Plataforma: El frontend debe desarrollarse en Flutter para garantizar despliegue multiplataforma (Android/iOS), el backend de gestión debe desarrollarse en Java y el motor core de enrutamiento en C++, el mapa debe basarse en datos de Mapbox. El servicio de extracción de WhatsApp se desarrolla en Node.js por depender de la librería Baileys.</w:t>
+        <w:t xml:space="preserve">Restricción de Plataforma: El frontend debe desarrollarse en Flutter para garantizar despliegue multiplataforma (Android/iOS), el backend de gestión debe desarrollarse en Java y el motor core de enrutamiento en C++, el mapa debe basarse en datos de Mapbox. El servicio de WhatsApp/LLM se desarrolla en Node.js por depender de la librería Baileys.</w:t>
       </w:r>
     </w:p>
     <w:p>
@@ -3355,7 +3799,7 @@
         <w:rPr>
           <w:lang w:val="es-US"/>
         </w:rPr>
-        <w:t>Restricción Legal: El sistema debe proteger los datos personales y de ubicación de los usuarios, evitando compartirlos con terceros sin su consentimiento. Solo se monitorean grupos de WhatsApp cuyo administrador haya autorizado la presencia de la cuenta del proyecto; no se almacenan números ni nombres de los remitentes, y al proveedor del LLM se envía únicamente el texto y la fecha de los mensajes, lo que debe indicarse en la política de privacidad del sistema.</w:t>
+        <w:t xml:space="preserve">Restricción Legal: El sistema debe proteger los datos personales y de ubicación de los usuarios, evitando compartirlos con terceros sin su consentimiento; la ubicación solo se obtiene con la app abierta. Solo se monitorean grupos de WhatsApp cuyo administrador haya autorizado la presencia de la cuenta del proyecto; no se almacenan números ni nombres de los remitentes, y al proveedor del LLM se envía únicamente el texto y la fecha de los mensajes, lo que debe indicarse en la política de privacidad del sistema.</w:t>
       </w:r>
     </w:p>
     <w:p>
@@ -3396,7 +3840,7 @@
         <w:rPr>
           <w:lang w:val="es-US"/>
         </w:rPr>
-        <w:t>Servidor VPS básico para alojar el backend (Java), el motor core (C++), el servicio de extracción de WhatsApp (Node.js) y la base de datos, dominio web con configuración DNS, dispositivos móviles Android o iOS con GPS y conexión a internet para ejecutar la aplicación Flutter, acceso al SDK de Mapbox como proveedor de mapas, un número telefónico dedicado para el monitoreo de WhatsApp y una credencial de acceso a la API del proveedor del LLM.</w:t>
+        <w:t xml:space="preserve">Servidor VPS básico para alojar el backend (Java), el motor core (C++), el servicio de WhatsApp/LLM (Node.js) y la base de datos, dominio web con configuración DNS, dispositivos móviles Android o iOS con GPS y conexión a internet para ejecutar la aplicación Flutter, acceso al SDK de Mapbox como proveedor de mapas, un número telefónico dedicado para el monitoreo de WhatsApp y una credencial de acceso a la API del proveedor del LLM.</w:t>
       </w:r>
     </w:p>
     <w:p>
@@ -3423,7 +3867,7 @@
         <w:rPr>
           <w:lang w:val="es-US"/>
         </w:rPr>
-        <w:t>El sistema debe responder a las consultas de rutas en menos de 3 segundos bajo una carga concurrente típica de usuarios. Los eventos viales reportados por los usuarios deben reflejarse en el mapa de otros usuarios en un tiempo no mayor a 5-10 segundos. El consumo de batería adicional atribuible a la aplicación no debe superar los niveles habituales de una app de navegación estándar, gracias a la activación condicional del GPS.</w:t>
+        <w:t xml:space="preserve">El sistema debe responder a las consultas de rutas en menos de 3 segundos bajo una carga concurrente típica de usuarios. Los eventos viales reportados por los usuarios deben reflejarse en el mapa de otros usuarios en un tiempo no mayor a 5-10 segundos; para lograrlo, la app consulta los eventos cada 5 segundos. El estado de un surtidor debe actualizarse en menos de 6 minutos desde que llega el mensaje de WhatsApp. El consumo de batería adicional atribuible a la aplicación no debe superar los niveles habituales de una app de navegación estándar, ya que el GPS solo se usa con la app abierta.</w:t>
       </w:r>
     </w:p>
     <w:p>
@@ -3486,7 +3930,7 @@
         <w:rPr>
           <w:lang w:val="es-US"/>
         </w:rPr>
-        <w:t>Las contraseñas de usuario deben almacenarse con hash + salt (ej. bcrypt), nunca en texto plano.</w:t>
+        <w:t xml:space="preserve">El sistema no almacena contraseñas: la identidad de cada usuario la verifica Google (Google Sign-In).</w:t>
       </w:r>
     </w:p>
     <w:p>
@@ -3504,7 +3948,7 @@
         <w:rPr>
           <w:lang w:val="es-US"/>
         </w:rPr>
-        <w:t>Los datos de ubicación deben tratarse como sensibles: minimizar su retención (no guardar historial de rutas más tiempo del necesario) y anonimizar/agregar los datos usados para el simulador o análisis de densidad de tráfico.</w:t>
+        <w:t xml:space="preserve">Los datos de ubicación deben tratarse como sensibles: solo se obtienen con la app abierta, se minimiza su retención (no guardar historial de rutas más tiempo del necesario) y se anonimizan/agregan los datos usados para el simulador o análisis de densidad de tráfico.</w:t>
       </w:r>
     </w:p>
     <w:p>
@@ -3553,7 +3997,7 @@
         <w:rPr>
           <w:lang w:val="es-US"/>
         </w:rPr>
-        <w:t>Verificación de cuentas de usuario mediante inicio de sesión con correo Gmail de Google (Google Sign-In).</w:t>
+        <w:t xml:space="preserve">Acceso únicamente mediante inicio de sesión con cuenta de Google (Google Sign-In); todas las funciones de la app requieren sesión iniciada.</w:t>
       </w:r>
     </w:p>
     <w:p>
@@ -3585,7 +4029,26 @@
           <w:lang w:val="es-US"/>
         </w:rPr>
         <w:lastRenderedPageBreak/>
-        <w:t>Validación/rate-limiting para evitar que un usuario (o bot) sature el sistema con reportes falsos de eventos viales o de combustible.</w:t>
+        <w:t xml:space="preserve">Validación/rate-limiting para evitar que un usuario (o bot) sature el sistema con reportes falsos de eventos viales o con confirmaciones falsas de combustible.</w:t>
+      </w:r>
+    </w:p>
+    <w:p>
+      <w:pPr>
+        <w:pStyle w:val="Prrafodelista"/>
+        <w:numPr>
+          <w:ilvl w:val="0"/>
+          <w:numId w:val="14"/>
+        </w:numPr>
+        <w:rPr>
+          <w:lang w:val="es-US"/>
+        </w:rPr>
+      </w:pPr>
+      <w:r>
+        <w:rPr>
+          <w:lang w:val="es-US"/>
+        </w:rPr>
+        <w:lastRenderedPageBreak/>
+        <w:t xml:space="preserve">Los votos “real” o “falso” de los demás conductores permiten retirar del mapa los eventos falsos.</w:t>
       </w:r>
     </w:p>
     <w:p>
@@ -3665,7 +4128,7 @@
         <w:rPr>
           <w:lang w:val="es-US"/>
         </w:rPr>
-        <w:t>Política de privacidad clara indicando qué datos se recolectan (ubicación, reportes) y que no se comparten con terceros.</w:t>
+        <w:t xml:space="preserve">Política de privacidad clara indicando qué datos se recolectan (ubicación, reportes) y que no se comparten con terceros, con una única excepción: el texto y la fecha de los mensajes de los grupos de WhatsApp se envían al proveedor del LLM, sin datos del remitente.</w:t>
       </w:r>
     </w:p>
     <w:p>
@@ -3726,7 +4189,7 @@
         <w:rPr>
           <w:lang w:val="es-US"/>
         </w:rPr>
-        <w:t>&lt;Definir qué entregables escritos recibirá el cliente para dar soporte al sistema en operación. Ej: Manual de Usuario, Ayuda en Línea contextual, o Guía de Instalación y Despliegue.&gt;</w:t>
+        <w:t xml:space="preserve">El equipo entregará un manual de usuario para el conductor, con las funciones principales de la app (reportar y ver eventos, calcular rutas y consultar combustible), y una guía de instalación y despliegue del backend, el motor core, el servicio de WhatsApp/LLM y el simulador.</w:t>
       </w:r>
     </w:p>
     <w:p>
@@ -3753,7 +4216,7 @@
         <w:rPr>
           <w:lang w:val="es-US"/>
         </w:rPr>
-        <w:t>&lt;Mencionar logotipos de la corporación, marcas registradas, íconos y propiedad intelectual que debe mostrarse en la aplicación y sus manuales.&gt;</w:t>
+        <w:t xml:space="preserve">La aplicación y sus manuales mostrarán el nombre y el logotipo de ChuroViaje. Los documentos académicos llevan además la identificación de la Universidad Católica Boliviana. El mapa debe mostrar la atribución que exigen Mapbox y OpenStreetMap.</w:t>
       </w:r>
     </w:p>
     <w:sectPr>

</xml_diff>